<commit_message>
121151 corrections note: the SU2 papers' memorandum and SU4's answer keys
Co-Authored-By: Claude Opus 5.5 <noreply@anthropic.com>
</commit_message>
<xml_diff>
--- a/FOR-HEIDI-121151-corrections.docx
+++ b/FOR-HEIDI-121151-corrections.docx
@@ -342,7 +342,7 @@
                 <w:color w:val="1A1A1A"/>
                 <w:sz w:val="19"/>
               </w:rPr>
-              <w:t>You, below.</w:t>
+              <w:t>You, items 1 to 4 below.</w:t>
             </w:r>
           </w:p>
         </w:tc>
@@ -352,6 +352,20 @@
       <w:pPr>
         <w:spacing w:after="80"/>
       </w:pPr>
+    </w:p>
+    <w:p>
+      <w:pPr>
+        <w:spacing w:after="140"/>
+      </w:pPr>
+      <w:r>
+        <w:rPr>
+          <w:rFonts w:ascii="Inter" w:hAnsi="Inter"/>
+          <w:b w:val="0"/>
+          <w:color w:val="1A1A1A"/>
+          <w:sz w:val="21"/>
+        </w:rPr>
+        <w:t>While checking, two further faults turned up that do not appear among the 22 but need your attention, one of them urgently: items 5 and 6.</w:t>
+      </w:r>
     </w:p>
     <w:p>
       <w:pPr>
@@ -1539,6 +1553,205 @@
           <w:color w:val="0D1E32"/>
           <w:sz w:val="28"/>
         </w:rPr>
+        <w:t>Two more things found while checking</w:t>
+      </w:r>
+    </w:p>
+    <w:p>
+      <w:pPr>
+        <w:spacing w:after="140"/>
+      </w:pPr>
+      <w:r>
+        <w:rPr>
+          <w:rFonts w:ascii="Inter" w:hAnsi="Inter"/>
+          <w:b w:val="0"/>
+          <w:color w:val="1A1A1A"/>
+          <w:sz w:val="21"/>
+        </w:rPr>
+        <w:t>These do not hold the qualification back on the page, but the first matters more than anything above.</w:t>
+      </w:r>
+    </w:p>
+    <w:p>
+      <w:pPr>
+        <w:keepNext/>
+        <w:spacing w:before="200" w:after="60"/>
+      </w:pPr>
+      <w:r>
+        <w:rPr>
+          <w:rFonts w:ascii="Montserrat" w:hAnsi="Montserrat"/>
+          <w:b/>
+          <w:color w:val="0D1E32"/>
+          <w:sz w:val="23"/>
+        </w:rPr>
+        <w:t>5. The SU2 summative papers contain their own memorandum</w:t>
+      </w:r>
+    </w:p>
+    <w:p>
+      <w:pPr>
+        <w:spacing w:after="140"/>
+      </w:pPr>
+      <w:r>
+        <w:rPr>
+          <w:rFonts w:ascii="Inter" w:hAnsi="Inter"/>
+          <w:b/>
+          <w:color w:val="1A1A1A"/>
+          <w:sz w:val="21"/>
+        </w:rPr>
+        <w:t>CA 121151 SU2 SA2 V1.docx</w:t>
+      </w:r>
+      <w:r>
+        <w:rPr>
+          <w:rFonts w:ascii="Inter" w:hAnsi="Inter"/>
+          <w:b w:val="0"/>
+          <w:color w:val="1A1A1A"/>
+          <w:sz w:val="21"/>
+        </w:rPr>
+        <w:t xml:space="preserve"> and </w:t>
+      </w:r>
+      <w:r>
+        <w:rPr>
+          <w:rFonts w:ascii="Inter" w:hAnsi="Inter"/>
+          <w:b/>
+          <w:color w:val="1A1A1A"/>
+          <w:sz w:val="21"/>
+        </w:rPr>
+        <w:t>CA 121151 SU2 SA2 V2.docx</w:t>
+      </w:r>
+      <w:r>
+        <w:rPr>
+          <w:rFonts w:ascii="Inter" w:hAnsi="Inter"/>
+          <w:b w:val="0"/>
+          <w:color w:val="1A1A1A"/>
+          <w:sz w:val="21"/>
+        </w:rPr>
+        <w:t xml:space="preserve"> are the learners' question papers, and each carries the full marking guide from about two thirds of the way through: "MEMORANDUM &amp; MARKING GUIDE (ASSESSOR USE ONLY)" in Version 1, and "MEMORANDUM &amp; MARKING GUIDE - VERSION 2 (ASSESSOR USE ONLY)" in Version 2, followed by the model answers. A learner given either file would have the answers. The separate assessor guides, CA 121151 SU2 SA2 V1 AG.docx and V2 AG.docx, already hold the same material.</w:t>
+      </w:r>
+    </w:p>
+    <w:p>
+      <w:pPr>
+        <w:spacing w:after="140"/>
+      </w:pPr>
+      <w:r>
+        <w:rPr>
+          <w:rFonts w:ascii="Inter" w:hAnsi="Inter"/>
+          <w:b/>
+          <w:color w:val="1A1A1A"/>
+          <w:sz w:val="21"/>
+        </w:rPr>
+        <w:t>To correct:</w:t>
+      </w:r>
+      <w:r>
+        <w:rPr>
+          <w:rFonts w:ascii="Inter" w:hAnsi="Inter"/>
+          <w:b w:val="0"/>
+          <w:color w:val="1A1A1A"/>
+          <w:sz w:val="21"/>
+        </w:rPr>
+        <w:t xml:space="preserve"> delete everything from the memorandum heading onwards in both learner papers, and upload them again.</w:t>
+      </w:r>
+    </w:p>
+    <w:p>
+      <w:pPr>
+        <w:keepNext/>
+        <w:spacing w:before="200" w:after="60"/>
+      </w:pPr>
+      <w:r>
+        <w:rPr>
+          <w:rFonts w:ascii="Montserrat" w:hAnsi="Montserrat"/>
+          <w:b/>
+          <w:color w:val="0D1E32"/>
+          <w:sz w:val="23"/>
+        </w:rPr>
+        <w:t>6. SU4 workbooks 2 and 3: every multiple-choice answer is B</w:t>
+      </w:r>
+    </w:p>
+    <w:p>
+      <w:pPr>
+        <w:spacing w:after="140"/>
+      </w:pPr>
+      <w:r>
+        <w:rPr>
+          <w:rFonts w:ascii="Inter" w:hAnsi="Inter"/>
+          <w:b w:val="0"/>
+          <w:color w:val="1A1A1A"/>
+          <w:sz w:val="21"/>
+        </w:rPr>
+        <w:t xml:space="preserve">In </w:t>
+      </w:r>
+      <w:r>
+        <w:rPr>
+          <w:rFonts w:ascii="Inter" w:hAnsi="Inter"/>
+          <w:b/>
+          <w:color w:val="1A1A1A"/>
+          <w:sz w:val="21"/>
+        </w:rPr>
+        <w:t>CA 121151 SU4 WB2 AG.docx</w:t>
+      </w:r>
+      <w:r>
+        <w:rPr>
+          <w:rFonts w:ascii="Inter" w:hAnsi="Inter"/>
+          <w:b w:val="0"/>
+          <w:color w:val="1A1A1A"/>
+          <w:sz w:val="21"/>
+        </w:rPr>
+        <w:t xml:space="preserve"> and </w:t>
+      </w:r>
+      <w:r>
+        <w:rPr>
+          <w:rFonts w:ascii="Inter" w:hAnsi="Inter"/>
+          <w:b/>
+          <w:color w:val="1A1A1A"/>
+          <w:sz w:val="21"/>
+        </w:rPr>
+        <w:t>CA 121151 SU4 WB3 AG.docx</w:t>
+      </w:r>
+      <w:r>
+        <w:rPr>
+          <w:rFonts w:ascii="Inter" w:hAnsi="Inter"/>
+          <w:b w:val="0"/>
+          <w:color w:val="1A1A1A"/>
+          <w:sz w:val="21"/>
+        </w:rPr>
+        <w:t>, all five multiple-choice questions in Part A have B as the correct option. A learner who notices can score full marks without reading the questions.</w:t>
+      </w:r>
+    </w:p>
+    <w:p>
+      <w:pPr>
+        <w:spacing w:after="140"/>
+      </w:pPr>
+      <w:r>
+        <w:rPr>
+          <w:rFonts w:ascii="Inter" w:hAnsi="Inter"/>
+          <w:b/>
+          <w:color w:val="1A1A1A"/>
+          <w:sz w:val="21"/>
+        </w:rPr>
+        <w:t>To correct:</w:t>
+      </w:r>
+      <w:r>
+        <w:rPr>
+          <w:rFonts w:ascii="Inter" w:hAnsi="Inter"/>
+          <w:b w:val="0"/>
+          <w:color w:val="1A1A1A"/>
+          <w:sz w:val="21"/>
+        </w:rPr>
+        <w:t xml:space="preserve"> shuffle the options in the workbooks, and update the letters in the two guides to match.</w:t>
+      </w:r>
+    </w:p>
+    <w:p>
+      <w:pPr>
+        <w:keepNext/>
+        <w:spacing w:before="280" w:after="60"/>
+        <w:pBdr>
+          <w:bottom w:val="single" w:sz="4" w:space="8" w:color="B9975B"/>
+        </w:pBdr>
+      </w:pPr>
+      <w:r>
+        <w:rPr>
+          <w:rFonts w:ascii="Montserrat" w:hAnsi="Montserrat"/>
+          <w:b/>
+          <w:color w:val="0D1E32"/>
+          <w:sz w:val="28"/>
+        </w:rPr>
         <w:t>A small tidy-up while you are there</w:t>
       </w:r>
     </w:p>

</xml_diff>